<commit_message>
fitur hybrid model: artefak JSON + retrain threshold + riwayat segmentasi
- core_ml: fit_model / score_with_model / check_retrain (4 ambang: data baru 10%, silhouette 0.35, drift 10%, umur 90 hari), helper scaler & mapping F+M-R

- model_store: simpan/load artefak models_ml/model_v{N}.json + registry ml_models (1 model aktif)

- segmentasi: RFM upsert (bukan delete), skoring via artefak, Elbow/Silhouette dari artefak, perbaikan skala tabel normalisasi, tombol retrain (admin)

- models: tabel baru ml_models & segmentasi_riwayat (snapshot per run untuk analisis migrasi segmen)

- template: kartu status model, banner ambang retrain, tabel riwayat & migrasi; alur langkah 1-5 dipertahankan

- notebook eksperimen (Elbow K=3, Silhouette 0.505, bukti normalisasi 0.294->0.505) + requirements-dev.txt

- skripsi: Flask (bukan Laravel), Tabel 6 Tertile, periode Januari 2026, narasi Elbow/Silhouette/retrain

- black box testing 22/22 lulus (scratch/blackbox_testing.py)
</commit_message>
<xml_diff>
--- a/SafiraAzzahra-2220803049-SKRIPSI.docx
+++ b/SafiraAzzahra-2220803049-SKRIPSI.docx
@@ -9919,29 +9919,25 @@
           <w:rFonts w:eastAsia="Times New Roman" w:cs="Times New Roman"/>
           <w:szCs w:val="24"/>
         </w:rPr>
-        <w:lastRenderedPageBreak/>
-        <w:t xml:space="preserve">Dalam penelitian ini, data yang dimanfaatkan adalah data transaksi pelanggan pada periode Juli hingga </w:t>
+        <w:t>Dalam penelitian ini, data yang dimanfaatkan adalah data transaksi pelanggan pada periode Januari tahun 2026, yang berfungsi sebagai data input dalam perhitungan RFM dan proses clustering.</w:t>
       </w:r>
       <w:r>
         <w:rPr>
           <w:rFonts w:eastAsia="Times New Roman" w:cs="Times New Roman"/>
           <w:szCs w:val="24"/>
         </w:rPr>
-        <w:t>November</w:t>
       </w:r>
       <w:r>
         <w:rPr>
           <w:rFonts w:eastAsia="Times New Roman" w:cs="Times New Roman"/>
           <w:szCs w:val="24"/>
         </w:rPr>
-        <w:t xml:space="preserve"> tahun 2026.</w:t>
       </w:r>
       <w:r>
         <w:rPr>
           <w:rFonts w:eastAsia="Times New Roman" w:cs="Times New Roman"/>
           <w:szCs w:val="24"/>
         </w:rPr>
-        <w:t xml:space="preserve"> yang berfungsi sebagai data input dalam perhitungan </w:t>
       </w:r>
       <w:r>
         <w:rPr>
@@ -9950,14 +9946,12 @@
           <w:iCs/>
           <w:szCs w:val="24"/>
         </w:rPr>
-        <w:t>RFM</w:t>
       </w:r>
       <w:r>
         <w:rPr>
           <w:rFonts w:eastAsia="Times New Roman" w:cs="Times New Roman"/>
           <w:szCs w:val="24"/>
         </w:rPr>
-        <w:t xml:space="preserve"> dan proses </w:t>
       </w:r>
       <w:r>
         <w:rPr>
@@ -9966,14 +9960,12 @@
           <w:iCs/>
           <w:szCs w:val="24"/>
         </w:rPr>
-        <w:t>clustering</w:t>
       </w:r>
       <w:r>
         <w:rPr>
           <w:rFonts w:eastAsia="Times New Roman" w:cs="Times New Roman"/>
           <w:szCs w:val="24"/>
         </w:rPr>
-        <w:t>.</w:t>
       </w:r>
     </w:p>
     <w:p>
@@ -27857,7 +27849,7 @@
         <w:rPr>
           <w:lang w:val="sv-SE"/>
         </w:rPr>
-        <w:t xml:space="preserve">Pengolahan data dilakukan menggunakan kerangka kerja </w:t>
+        <w:t>Pengolahan data dilakukan menggunakan kerangka kerja KDD, yang meliputi tahapan seleksi data, preprocessing, transformasi, data mining, serta evaluasi dan penyajian hasil. Data transaksi pelanggan diproses secara bertahap melalui pembersihan data, perhitungan nilai RFM, serta normalisasi sebelum digunakan dalam proses clustering. Penggunaan KDD bertujuan untuk memastikan proses pengolahan data dilakukan secara sistematis dan terstruktur. Pada tahap evaluasi pola, kualitas clustering diukur menggunakan Elbow Method untuk memverifikasi jumlah cluster optimal dan Silhouette Score untuk mengukur keterpisahan klaster. Evaluasi tersebut dijalankan melalui notebook eksperimen yang mengimpor fungsi pemrosesan data yang sama dengan sistem, sehingga hasil evaluasi yang diperoleh konsisten dengan hasil yang ditampilkan oleh sistem.</w:t>
       </w:r>
       <w:r>
         <w:rPr>
@@ -27865,13 +27857,11 @@
           <w:iCs/>
           <w:lang w:val="sv-SE"/>
         </w:rPr>
-        <w:t>KDD</w:t>
       </w:r>
       <w:r>
         <w:rPr>
           <w:lang w:val="sv-SE"/>
         </w:rPr>
-        <w:t xml:space="preserve">, yang meliputi tahapan seleksi data, </w:t>
       </w:r>
       <w:r>
         <w:rPr>
@@ -27879,13 +27869,11 @@
           <w:iCs/>
           <w:lang w:val="sv-SE"/>
         </w:rPr>
-        <w:t>preprocessing, transformasi, data mining, serta evaluasi</w:t>
       </w:r>
       <w:r>
         <w:rPr>
           <w:lang w:val="sv-SE"/>
         </w:rPr>
-        <w:t xml:space="preserve"> dan penyajian hasil. Data transaksi pelanggan diproses secara bertahap melalui pembersihan data, perhitungan nilai </w:t>
       </w:r>
       <w:r>
         <w:rPr>
@@ -27893,13 +27881,11 @@
           <w:iCs/>
           <w:lang w:val="sv-SE"/>
         </w:rPr>
-        <w:t>RFM</w:t>
       </w:r>
       <w:r>
         <w:rPr>
           <w:lang w:val="sv-SE"/>
         </w:rPr>
-        <w:t xml:space="preserve">, serta normalisasi sebelum digunakan dalam proses clustering. Penggunaan </w:t>
       </w:r>
       <w:r>
         <w:rPr>
@@ -27907,13 +27893,11 @@
           <w:iCs/>
           <w:lang w:val="sv-SE"/>
         </w:rPr>
-        <w:t>KDD</w:t>
       </w:r>
       <w:r>
         <w:rPr>
           <w:lang w:val="sv-SE"/>
         </w:rPr>
-        <w:t xml:space="preserve"> bertujuan untuk memastikan proses pengolahan data dilakukan secara sistematis dan terstruktur.</w:t>
       </w:r>
     </w:p>
     <w:p>
@@ -30911,98 +30895,85 @@
         <w:rPr>
           <w:lang w:val="en-US"/>
         </w:rPr>
-        <w:t>Penentuan</w:t>
-      </w:r>
-      <w:proofErr w:type="spellEnd"/>
-      <w:r>
-        <w:rPr>
-          <w:lang w:val="en-US"/>
-        </w:rPr>
-        <w:t xml:space="preserve"> range </w:t>
-      </w:r>
-      <w:proofErr w:type="spellStart"/>
-      <w:r>
-        <w:rPr>
-          <w:lang w:val="en-US"/>
-        </w:rPr>
-        <w:t>kelompok</w:t>
-      </w:r>
-      <w:proofErr w:type="spellEnd"/>
-      <w:r>
-        <w:rPr>
-          <w:lang w:val="en-US"/>
-        </w:rPr>
-        <w:t xml:space="preserve"> </w:t>
-      </w:r>
-      <w:proofErr w:type="spellStart"/>
-      <w:r>
-        <w:rPr>
-          <w:lang w:val="en-US"/>
-        </w:rPr>
-        <w:t>prioritas</w:t>
-      </w:r>
-      <w:proofErr w:type="spellEnd"/>
-      <w:r>
-        <w:rPr>
-          <w:lang w:val="en-US"/>
-        </w:rPr>
-        <w:t xml:space="preserve"> </w:t>
-      </w:r>
-      <w:proofErr w:type="spellStart"/>
-      <w:r>
-        <w:rPr>
-          <w:lang w:val="en-US"/>
-        </w:rPr>
-        <w:t>dilakukan</w:t>
-      </w:r>
-      <w:proofErr w:type="spellEnd"/>
-      <w:r>
-        <w:rPr>
-          <w:lang w:val="en-US"/>
-        </w:rPr>
-        <w:t xml:space="preserve"> </w:t>
-      </w:r>
-      <w:proofErr w:type="spellStart"/>
-      <w:r>
-        <w:rPr>
-          <w:lang w:val="en-US"/>
-        </w:rPr>
-        <w:t>untuk</w:t>
-      </w:r>
-      <w:proofErr w:type="spellEnd"/>
-      <w:r>
-        <w:rPr>
-          <w:lang w:val="en-US"/>
-        </w:rPr>
-        <w:t xml:space="preserve"> </w:t>
-      </w:r>
-      <w:proofErr w:type="spellStart"/>
-      <w:r>
-        <w:rPr>
-          <w:lang w:val="en-US"/>
-        </w:rPr>
-        <w:t>mengelompokkan</w:t>
-      </w:r>
-      <w:proofErr w:type="spellEnd"/>
-      <w:r>
-        <w:rPr>
-          <w:lang w:val="en-US"/>
-        </w:rPr>
-        <w:t xml:space="preserve"> </w:t>
-      </w:r>
-      <w:proofErr w:type="spellStart"/>
-      <w:r>
-        <w:rPr>
-          <w:lang w:val="en-US"/>
-        </w:rPr>
-        <w:t>nilai</w:t>
-      </w:r>
-      <w:proofErr w:type="spellEnd"/>
-      <w:r>
-        <w:rPr>
-          <w:lang w:val="en-US"/>
-        </w:rPr>
-        <w:t xml:space="preserve"> </w:t>
+        <w:t>Penentuan range kelompok prioritas dilakukan untuk mengelompokkan nilai RFM ke dalam kategori tinggi, sedang, dan rendah sehingga mempermudah proses interpretasi hasil segmentasi pelanggan. Pada penelitian ini, range ditentukan menggunakan metode Tertile, yaitu dengan membagi distribusi nilai RFM pelanggan menjadi tiga kelompok berukuran sama besar berdasarkan nilai persentil 33,33% dan persentil 66,67% dari data pelanggan yang bertransaksi. Nilai pada persentil 33,33 ke bawah termasuk kelompok rendah, nilai antara persentil 33,33 sampai 66,67 termasuk kelompok sedang, dan nilai di atas persentil 66,67 termasuk kelompok tinggi. Untuk Recency berlaku kebalikannya, yaitu nilai recency yang kecil (persentil 33,33 ke bawah) termasuk kelompok tinggi karena menunjukkan transaksi terbaru. Metode Tertile dipilih karena distribusi nilai transaksi pelanggan tidak selalu merata, sehingga pembagian berdasarkan persentil mampu menghasilkan tiga kelompok yang seimbang pada data yang bersifat skew. Hasil pembagian tersebut digunakan sebagai dasar dalam penentuan kelompok prioritas pelanggan pada sistem.</w:t>
+      </w:r>
+      <w:proofErr w:type="spellEnd"/>
+      <w:r>
+        <w:rPr>
+          <w:lang w:val="en-US"/>
+        </w:rPr>
+      </w:r>
+      <w:proofErr w:type="spellStart"/>
+      <w:r>
+        <w:rPr>
+          <w:lang w:val="en-US"/>
+        </w:rPr>
+      </w:r>
+      <w:proofErr w:type="spellEnd"/>
+      <w:r>
+        <w:rPr>
+          <w:lang w:val="en-US"/>
+        </w:rPr>
+      </w:r>
+      <w:proofErr w:type="spellStart"/>
+      <w:r>
+        <w:rPr>
+          <w:lang w:val="en-US"/>
+        </w:rPr>
+      </w:r>
+      <w:proofErr w:type="spellEnd"/>
+      <w:r>
+        <w:rPr>
+          <w:lang w:val="en-US"/>
+        </w:rPr>
+      </w:r>
+      <w:proofErr w:type="spellStart"/>
+      <w:r>
+        <w:rPr>
+          <w:lang w:val="en-US"/>
+        </w:rPr>
+      </w:r>
+      <w:proofErr w:type="spellEnd"/>
+      <w:r>
+        <w:rPr>
+          <w:lang w:val="en-US"/>
+        </w:rPr>
+      </w:r>
+      <w:proofErr w:type="spellStart"/>
+      <w:r>
+        <w:rPr>
+          <w:lang w:val="en-US"/>
+        </w:rPr>
+      </w:r>
+      <w:proofErr w:type="spellEnd"/>
+      <w:r>
+        <w:rPr>
+          <w:lang w:val="en-US"/>
+        </w:rPr>
+      </w:r>
+      <w:proofErr w:type="spellStart"/>
+      <w:r>
+        <w:rPr>
+          <w:lang w:val="en-US"/>
+        </w:rPr>
+      </w:r>
+      <w:proofErr w:type="spellEnd"/>
+      <w:r>
+        <w:rPr>
+          <w:lang w:val="en-US"/>
+        </w:rPr>
+      </w:r>
+      <w:proofErr w:type="spellStart"/>
+      <w:r>
+        <w:rPr>
+          <w:lang w:val="en-US"/>
+        </w:rPr>
+      </w:r>
+      <w:proofErr w:type="spellEnd"/>
+      <w:r>
+        <w:rPr>
+          <w:lang w:val="en-US"/>
+        </w:rPr>
       </w:r>
       <w:r>
         <w:rPr>
@@ -31010,258 +30981,220 @@
           <w:iCs/>
           <w:lang w:val="en-US"/>
         </w:rPr>
-        <w:t>RFM</w:t>
-      </w:r>
-      <w:r>
-        <w:rPr>
-          <w:lang w:val="en-US"/>
-        </w:rPr>
-        <w:t xml:space="preserve"> </w:t>
-      </w:r>
-      <w:proofErr w:type="spellStart"/>
-      <w:r>
-        <w:rPr>
-          <w:lang w:val="en-US"/>
-        </w:rPr>
-        <w:t>ke</w:t>
-      </w:r>
-      <w:proofErr w:type="spellEnd"/>
-      <w:r>
-        <w:rPr>
-          <w:lang w:val="en-US"/>
-        </w:rPr>
-        <w:t xml:space="preserve"> </w:t>
-      </w:r>
-      <w:proofErr w:type="spellStart"/>
-      <w:r>
-        <w:rPr>
-          <w:lang w:val="en-US"/>
-        </w:rPr>
-        <w:t>dalam</w:t>
-      </w:r>
-      <w:proofErr w:type="spellEnd"/>
-      <w:r>
-        <w:rPr>
-          <w:lang w:val="en-US"/>
-        </w:rPr>
-        <w:t xml:space="preserve"> </w:t>
-      </w:r>
-      <w:proofErr w:type="spellStart"/>
-      <w:r>
-        <w:rPr>
-          <w:lang w:val="en-US"/>
-        </w:rPr>
-        <w:t>kategori</w:t>
-      </w:r>
-      <w:proofErr w:type="spellEnd"/>
-      <w:r>
-        <w:rPr>
-          <w:lang w:val="en-US"/>
-        </w:rPr>
-        <w:t xml:space="preserve"> </w:t>
-      </w:r>
-      <w:proofErr w:type="spellStart"/>
-      <w:r>
-        <w:rPr>
-          <w:lang w:val="en-US"/>
-        </w:rPr>
-        <w:t>tinggi</w:t>
-      </w:r>
-      <w:proofErr w:type="spellEnd"/>
-      <w:r>
-        <w:rPr>
-          <w:lang w:val="en-US"/>
-        </w:rPr>
-        <w:t xml:space="preserve">, </w:t>
-      </w:r>
-      <w:proofErr w:type="spellStart"/>
-      <w:r>
-        <w:rPr>
-          <w:lang w:val="en-US"/>
-        </w:rPr>
-        <w:t>sedang</w:t>
-      </w:r>
-      <w:proofErr w:type="spellEnd"/>
-      <w:r>
-        <w:rPr>
-          <w:lang w:val="en-US"/>
-        </w:rPr>
-        <w:t xml:space="preserve">, dan </w:t>
-      </w:r>
-      <w:proofErr w:type="spellStart"/>
-      <w:r>
-        <w:rPr>
-          <w:lang w:val="en-US"/>
-        </w:rPr>
-        <w:t>rendah</w:t>
-      </w:r>
-      <w:proofErr w:type="spellEnd"/>
-      <w:r>
-        <w:rPr>
-          <w:lang w:val="en-US"/>
-        </w:rPr>
-        <w:t xml:space="preserve"> </w:t>
-      </w:r>
-      <w:proofErr w:type="spellStart"/>
-      <w:r>
-        <w:rPr>
-          <w:lang w:val="en-US"/>
-        </w:rPr>
-        <w:t>sehingga</w:t>
-      </w:r>
-      <w:proofErr w:type="spellEnd"/>
-      <w:r>
-        <w:rPr>
-          <w:lang w:val="en-US"/>
-        </w:rPr>
-        <w:t xml:space="preserve"> </w:t>
-      </w:r>
-      <w:proofErr w:type="spellStart"/>
-      <w:r>
-        <w:rPr>
-          <w:lang w:val="en-US"/>
-        </w:rPr>
-        <w:t>mempermudah</w:t>
-      </w:r>
-      <w:proofErr w:type="spellEnd"/>
-      <w:r>
-        <w:rPr>
-          <w:lang w:val="en-US"/>
-        </w:rPr>
-        <w:t xml:space="preserve"> </w:t>
-      </w:r>
-      <w:r>
-        <w:rPr>
-          <w:lang w:val="en-US"/>
-        </w:rPr>
-        <w:lastRenderedPageBreak/>
-        <w:t xml:space="preserve">proses </w:t>
-      </w:r>
-      <w:proofErr w:type="spellStart"/>
-      <w:r>
-        <w:rPr>
-          <w:lang w:val="en-US"/>
-        </w:rPr>
-        <w:t>interpretasi</w:t>
-      </w:r>
-      <w:proofErr w:type="spellEnd"/>
-      <w:r>
-        <w:rPr>
-          <w:lang w:val="en-US"/>
-        </w:rPr>
-        <w:t xml:space="preserve"> </w:t>
-      </w:r>
-      <w:proofErr w:type="spellStart"/>
-      <w:r>
-        <w:rPr>
-          <w:lang w:val="en-US"/>
-        </w:rPr>
-        <w:t>hasil</w:t>
-      </w:r>
-      <w:proofErr w:type="spellEnd"/>
-      <w:r>
-        <w:rPr>
-          <w:lang w:val="en-US"/>
-        </w:rPr>
-        <w:t xml:space="preserve"> </w:t>
-      </w:r>
-      <w:proofErr w:type="spellStart"/>
-      <w:r>
-        <w:rPr>
-          <w:lang w:val="en-US"/>
-        </w:rPr>
-        <w:t>segmentasi</w:t>
-      </w:r>
-      <w:proofErr w:type="spellEnd"/>
-      <w:r>
-        <w:rPr>
-          <w:lang w:val="en-US"/>
-        </w:rPr>
-        <w:t xml:space="preserve"> </w:t>
-      </w:r>
-      <w:proofErr w:type="spellStart"/>
-      <w:r>
-        <w:rPr>
-          <w:lang w:val="en-US"/>
-        </w:rPr>
-        <w:t>pelanggan</w:t>
-      </w:r>
-      <w:proofErr w:type="spellEnd"/>
-      <w:r>
-        <w:rPr>
-          <w:lang w:val="en-US"/>
-        </w:rPr>
-        <w:t xml:space="preserve">. Pada </w:t>
-      </w:r>
-      <w:proofErr w:type="spellStart"/>
-      <w:r>
-        <w:rPr>
-          <w:lang w:val="en-US"/>
-        </w:rPr>
-        <w:t>penelitian</w:t>
-      </w:r>
-      <w:proofErr w:type="spellEnd"/>
-      <w:r>
-        <w:rPr>
-          <w:lang w:val="en-US"/>
-        </w:rPr>
-        <w:t xml:space="preserve"> </w:t>
-      </w:r>
-      <w:proofErr w:type="spellStart"/>
-      <w:r>
-        <w:rPr>
-          <w:lang w:val="en-US"/>
-        </w:rPr>
-        <w:t>ini</w:t>
-      </w:r>
-      <w:proofErr w:type="spellEnd"/>
-      <w:r>
-        <w:rPr>
-          <w:lang w:val="en-US"/>
-        </w:rPr>
-        <w:t xml:space="preserve">, range </w:t>
-      </w:r>
-      <w:proofErr w:type="spellStart"/>
-      <w:r>
-        <w:rPr>
-          <w:lang w:val="en-US"/>
-        </w:rPr>
-        <w:t>ditentukan</w:t>
-      </w:r>
-      <w:proofErr w:type="spellEnd"/>
-      <w:r>
-        <w:rPr>
-          <w:lang w:val="en-US"/>
-        </w:rPr>
-        <w:t xml:space="preserve"> </w:t>
-      </w:r>
-      <w:proofErr w:type="spellStart"/>
-      <w:r>
-        <w:rPr>
-          <w:lang w:val="en-US"/>
-        </w:rPr>
-        <w:t>menggunakan</w:t>
-      </w:r>
-      <w:proofErr w:type="spellEnd"/>
-      <w:r>
-        <w:rPr>
-          <w:lang w:val="en-US"/>
-        </w:rPr>
-        <w:t xml:space="preserve"> </w:t>
-      </w:r>
-      <w:proofErr w:type="spellStart"/>
-      <w:r>
-        <w:rPr>
-          <w:lang w:val="en-US"/>
-        </w:rPr>
-        <w:t>metode</w:t>
-      </w:r>
-      <w:proofErr w:type="spellEnd"/>
-      <w:r>
-        <w:rPr>
-          <w:lang w:val="en-US"/>
-        </w:rPr>
-        <w:t xml:space="preserve"> </w:t>
+      </w:r>
+      <w:r>
+        <w:rPr>
+          <w:lang w:val="en-US"/>
+        </w:rPr>
+      </w:r>
+      <w:proofErr w:type="spellStart"/>
+      <w:r>
+        <w:rPr>
+          <w:lang w:val="en-US"/>
+        </w:rPr>
+      </w:r>
+      <w:proofErr w:type="spellEnd"/>
+      <w:r>
+        <w:rPr>
+          <w:lang w:val="en-US"/>
+        </w:rPr>
+      </w:r>
+      <w:proofErr w:type="spellStart"/>
+      <w:r>
+        <w:rPr>
+          <w:lang w:val="en-US"/>
+        </w:rPr>
+      </w:r>
+      <w:proofErr w:type="spellEnd"/>
+      <w:r>
+        <w:rPr>
+          <w:lang w:val="en-US"/>
+        </w:rPr>
+      </w:r>
+      <w:proofErr w:type="spellStart"/>
+      <w:r>
+        <w:rPr>
+          <w:lang w:val="en-US"/>
+        </w:rPr>
+      </w:r>
+      <w:proofErr w:type="spellEnd"/>
+      <w:r>
+        <w:rPr>
+          <w:lang w:val="en-US"/>
+        </w:rPr>
+      </w:r>
+      <w:proofErr w:type="spellStart"/>
+      <w:r>
+        <w:rPr>
+          <w:lang w:val="en-US"/>
+        </w:rPr>
+      </w:r>
+      <w:proofErr w:type="spellEnd"/>
+      <w:r>
+        <w:rPr>
+          <w:lang w:val="en-US"/>
+        </w:rPr>
+      </w:r>
+      <w:proofErr w:type="spellStart"/>
+      <w:r>
+        <w:rPr>
+          <w:lang w:val="en-US"/>
+        </w:rPr>
+      </w:r>
+      <w:proofErr w:type="spellEnd"/>
+      <w:r>
+        <w:rPr>
+          <w:lang w:val="en-US"/>
+        </w:rPr>
+      </w:r>
+      <w:proofErr w:type="spellStart"/>
+      <w:r>
+        <w:rPr>
+          <w:lang w:val="en-US"/>
+        </w:rPr>
+      </w:r>
+      <w:proofErr w:type="spellEnd"/>
+      <w:r>
+        <w:rPr>
+          <w:lang w:val="en-US"/>
+        </w:rPr>
+      </w:r>
+      <w:proofErr w:type="spellStart"/>
+      <w:r>
+        <w:rPr>
+          <w:lang w:val="en-US"/>
+        </w:rPr>
+      </w:r>
+      <w:proofErr w:type="spellEnd"/>
+      <w:r>
+        <w:rPr>
+          <w:lang w:val="en-US"/>
+        </w:rPr>
+      </w:r>
+      <w:proofErr w:type="spellStart"/>
+      <w:r>
+        <w:rPr>
+          <w:lang w:val="en-US"/>
+        </w:rPr>
+      </w:r>
+      <w:proofErr w:type="spellEnd"/>
+      <w:r>
+        <w:rPr>
+          <w:lang w:val="en-US"/>
+        </w:rPr>
+      </w:r>
+      <w:r>
+        <w:rPr>
+          <w:lang w:val="en-US"/>
+        </w:rPr>
+      </w:r>
+      <w:proofErr w:type="spellStart"/>
+      <w:r>
+        <w:rPr>
+          <w:lang w:val="en-US"/>
+        </w:rPr>
+      </w:r>
+      <w:proofErr w:type="spellEnd"/>
+      <w:r>
+        <w:rPr>
+          <w:lang w:val="en-US"/>
+        </w:rPr>
+      </w:r>
+      <w:proofErr w:type="spellStart"/>
+      <w:r>
+        <w:rPr>
+          <w:lang w:val="en-US"/>
+        </w:rPr>
+      </w:r>
+      <w:proofErr w:type="spellEnd"/>
+      <w:r>
+        <w:rPr>
+          <w:lang w:val="en-US"/>
+        </w:rPr>
+      </w:r>
+      <w:proofErr w:type="spellStart"/>
+      <w:r>
+        <w:rPr>
+          <w:lang w:val="en-US"/>
+        </w:rPr>
+      </w:r>
+      <w:proofErr w:type="spellEnd"/>
+      <w:r>
+        <w:rPr>
+          <w:lang w:val="en-US"/>
+        </w:rPr>
+      </w:r>
+      <w:proofErr w:type="spellStart"/>
+      <w:r>
+        <w:rPr>
+          <w:lang w:val="en-US"/>
+        </w:rPr>
+      </w:r>
+      <w:proofErr w:type="spellEnd"/>
+      <w:r>
+        <w:rPr>
+          <w:lang w:val="en-US"/>
+        </w:rPr>
+      </w:r>
+      <w:proofErr w:type="spellStart"/>
+      <w:r>
+        <w:rPr>
+          <w:lang w:val="en-US"/>
+        </w:rPr>
+      </w:r>
+      <w:proofErr w:type="spellEnd"/>
+      <w:r>
+        <w:rPr>
+          <w:lang w:val="en-US"/>
+        </w:rPr>
+      </w:r>
+      <w:proofErr w:type="spellStart"/>
+      <w:r>
+        <w:rPr>
+          <w:lang w:val="en-US"/>
+        </w:rPr>
+      </w:r>
+      <w:proofErr w:type="spellEnd"/>
+      <w:r>
+        <w:rPr>
+          <w:lang w:val="en-US"/>
+        </w:rPr>
+      </w:r>
+      <w:proofErr w:type="spellStart"/>
+      <w:r>
+        <w:rPr>
+          <w:lang w:val="en-US"/>
+        </w:rPr>
+      </w:r>
+      <w:proofErr w:type="spellEnd"/>
+      <w:r>
+        <w:rPr>
+          <w:lang w:val="en-US"/>
+        </w:rPr>
+      </w:r>
+      <w:proofErr w:type="spellStart"/>
+      <w:r>
+        <w:rPr>
+          <w:lang w:val="en-US"/>
+        </w:rPr>
+      </w:r>
+      <w:proofErr w:type="spellEnd"/>
+      <w:r>
+        <w:rPr>
+          <w:lang w:val="en-US"/>
+        </w:rPr>
+      </w:r>
+      <w:proofErr w:type="spellStart"/>
+      <w:r>
+        <w:rPr>
+          <w:lang w:val="en-US"/>
+        </w:rPr>
+      </w:r>
+      <w:proofErr w:type="spellEnd"/>
+      <w:r>
+        <w:rPr>
+          <w:lang w:val="en-US"/>
+        </w:rPr>
       </w:r>
       <w:r>
         <w:rPr>
@@ -31269,307 +31202,263 @@
           <w:iCs/>
           <w:lang w:val="en-US"/>
         </w:rPr>
-        <w:t>Equal Interval</w:t>
-      </w:r>
-      <w:r>
-        <w:rPr>
-          <w:lang w:val="en-US"/>
-        </w:rPr>
-        <w:t xml:space="preserve">, </w:t>
-      </w:r>
-      <w:proofErr w:type="spellStart"/>
-      <w:r>
-        <w:rPr>
-          <w:lang w:val="en-US"/>
-        </w:rPr>
-        <w:t>yaitu</w:t>
-      </w:r>
-      <w:proofErr w:type="spellEnd"/>
-      <w:r>
-        <w:rPr>
-          <w:lang w:val="en-US"/>
-        </w:rPr>
-        <w:t xml:space="preserve"> </w:t>
-      </w:r>
-      <w:proofErr w:type="spellStart"/>
-      <w:r>
-        <w:rPr>
-          <w:lang w:val="en-US"/>
-        </w:rPr>
-        <w:t>dengan</w:t>
-      </w:r>
-      <w:proofErr w:type="spellEnd"/>
-      <w:r>
-        <w:rPr>
-          <w:lang w:val="en-US"/>
-        </w:rPr>
-        <w:t xml:space="preserve"> </w:t>
-      </w:r>
-      <w:proofErr w:type="spellStart"/>
-      <w:r>
-        <w:rPr>
-          <w:lang w:val="en-US"/>
-        </w:rPr>
-        <w:t>membagi</w:t>
-      </w:r>
-      <w:proofErr w:type="spellEnd"/>
-      <w:r>
-        <w:rPr>
-          <w:lang w:val="en-US"/>
-        </w:rPr>
-        <w:t xml:space="preserve"> </w:t>
-      </w:r>
-      <w:proofErr w:type="spellStart"/>
-      <w:r>
-        <w:rPr>
-          <w:lang w:val="en-US"/>
-        </w:rPr>
-        <w:t>rentang</w:t>
-      </w:r>
-      <w:proofErr w:type="spellEnd"/>
-      <w:r>
-        <w:rPr>
-          <w:lang w:val="en-US"/>
-        </w:rPr>
-        <w:t xml:space="preserve"> </w:t>
-      </w:r>
-      <w:proofErr w:type="spellStart"/>
-      <w:r>
-        <w:rPr>
-          <w:lang w:val="en-US"/>
-        </w:rPr>
-        <w:t>nilai</w:t>
-      </w:r>
-      <w:proofErr w:type="spellEnd"/>
-      <w:r>
-        <w:rPr>
-          <w:lang w:val="en-US"/>
-        </w:rPr>
-        <w:t xml:space="preserve"> </w:t>
-      </w:r>
-      <w:proofErr w:type="spellStart"/>
-      <w:r>
-        <w:rPr>
-          <w:lang w:val="en-US"/>
-        </w:rPr>
-        <w:t>normalisasi</w:t>
-      </w:r>
-      <w:proofErr w:type="spellEnd"/>
-      <w:r>
-        <w:rPr>
-          <w:lang w:val="en-US"/>
-        </w:rPr>
-        <w:t xml:space="preserve"> </w:t>
-      </w:r>
-      <w:proofErr w:type="spellStart"/>
-      <w:r>
-        <w:rPr>
-          <w:lang w:val="en-US"/>
-        </w:rPr>
-        <w:t>menjadi</w:t>
-      </w:r>
-      <w:proofErr w:type="spellEnd"/>
-      <w:r>
-        <w:rPr>
-          <w:lang w:val="en-US"/>
-        </w:rPr>
-        <w:t xml:space="preserve"> </w:t>
-      </w:r>
-      <w:proofErr w:type="spellStart"/>
-      <w:r>
-        <w:rPr>
-          <w:lang w:val="en-US"/>
-        </w:rPr>
-        <w:t>tiga</w:t>
-      </w:r>
-      <w:proofErr w:type="spellEnd"/>
-      <w:r>
-        <w:rPr>
-          <w:lang w:val="en-US"/>
-        </w:rPr>
-        <w:t xml:space="preserve"> interval yang </w:t>
-      </w:r>
-      <w:proofErr w:type="spellStart"/>
-      <w:r>
-        <w:rPr>
-          <w:lang w:val="en-US"/>
-        </w:rPr>
-        <w:t>sama</w:t>
-      </w:r>
-      <w:proofErr w:type="spellEnd"/>
-      <w:r>
-        <w:rPr>
-          <w:lang w:val="en-US"/>
-        </w:rPr>
-        <w:t xml:space="preserve"> </w:t>
-      </w:r>
-      <w:proofErr w:type="spellStart"/>
-      <w:r>
-        <w:rPr>
-          <w:lang w:val="en-US"/>
-        </w:rPr>
-        <w:t>besar</w:t>
-      </w:r>
-      <w:proofErr w:type="spellEnd"/>
-      <w:r>
-        <w:rPr>
-          <w:lang w:val="en-US"/>
-        </w:rPr>
-        <w:t xml:space="preserve">. Hasil </w:t>
-      </w:r>
-      <w:proofErr w:type="spellStart"/>
-      <w:r>
-        <w:rPr>
-          <w:lang w:val="en-US"/>
-        </w:rPr>
-        <w:t>pembagian</w:t>
-      </w:r>
-      <w:proofErr w:type="spellEnd"/>
-      <w:r>
-        <w:rPr>
-          <w:lang w:val="en-US"/>
-        </w:rPr>
-        <w:t xml:space="preserve"> </w:t>
-      </w:r>
-      <w:proofErr w:type="spellStart"/>
-      <w:r>
-        <w:rPr>
-          <w:lang w:val="en-US"/>
-        </w:rPr>
-        <w:t>tersebut</w:t>
-      </w:r>
-      <w:proofErr w:type="spellEnd"/>
-      <w:r>
-        <w:rPr>
-          <w:lang w:val="en-US"/>
-        </w:rPr>
-        <w:t xml:space="preserve"> </w:t>
-      </w:r>
-      <w:proofErr w:type="spellStart"/>
-      <w:r>
-        <w:rPr>
-          <w:lang w:val="en-US"/>
-        </w:rPr>
-        <w:t>digunakan</w:t>
-      </w:r>
-      <w:proofErr w:type="spellEnd"/>
-      <w:r>
-        <w:rPr>
-          <w:lang w:val="en-US"/>
-        </w:rPr>
-        <w:t xml:space="preserve"> </w:t>
-      </w:r>
-      <w:proofErr w:type="spellStart"/>
-      <w:r>
-        <w:rPr>
-          <w:lang w:val="en-US"/>
-        </w:rPr>
-        <w:t>sebagai</w:t>
-      </w:r>
-      <w:proofErr w:type="spellEnd"/>
-      <w:r>
-        <w:rPr>
-          <w:lang w:val="en-US"/>
-        </w:rPr>
-        <w:t xml:space="preserve"> </w:t>
-      </w:r>
-      <w:proofErr w:type="spellStart"/>
-      <w:r>
-        <w:rPr>
-          <w:lang w:val="en-US"/>
-        </w:rPr>
-        <w:t>dasar</w:t>
-      </w:r>
-      <w:proofErr w:type="spellEnd"/>
-      <w:r>
-        <w:rPr>
-          <w:lang w:val="en-US"/>
-        </w:rPr>
-        <w:t xml:space="preserve"> </w:t>
-      </w:r>
-      <w:proofErr w:type="spellStart"/>
-      <w:r>
-        <w:rPr>
-          <w:lang w:val="en-US"/>
-        </w:rPr>
-        <w:t>dalam</w:t>
-      </w:r>
-      <w:proofErr w:type="spellEnd"/>
-      <w:r>
-        <w:rPr>
-          <w:lang w:val="en-US"/>
-        </w:rPr>
-        <w:t xml:space="preserve"> </w:t>
-      </w:r>
-      <w:proofErr w:type="spellStart"/>
-      <w:r>
-        <w:rPr>
-          <w:lang w:val="en-US"/>
-        </w:rPr>
-        <w:t>penentuan</w:t>
-      </w:r>
-      <w:proofErr w:type="spellEnd"/>
-      <w:r>
-        <w:rPr>
-          <w:lang w:val="en-US"/>
-        </w:rPr>
-        <w:t xml:space="preserve"> </w:t>
-      </w:r>
-      <w:proofErr w:type="spellStart"/>
-      <w:r>
-        <w:rPr>
-          <w:lang w:val="en-US"/>
-        </w:rPr>
-        <w:t>kelompok</w:t>
-      </w:r>
-      <w:proofErr w:type="spellEnd"/>
-      <w:r>
-        <w:rPr>
-          <w:lang w:val="en-US"/>
-        </w:rPr>
-        <w:t xml:space="preserve"> </w:t>
-      </w:r>
-      <w:proofErr w:type="spellStart"/>
-      <w:r>
-        <w:rPr>
-          <w:lang w:val="en-US"/>
-        </w:rPr>
-        <w:t>prioritas</w:t>
-      </w:r>
-      <w:proofErr w:type="spellEnd"/>
-      <w:r>
-        <w:rPr>
-          <w:lang w:val="en-US"/>
-        </w:rPr>
-        <w:t xml:space="preserve"> </w:t>
-      </w:r>
-      <w:proofErr w:type="spellStart"/>
-      <w:r>
-        <w:rPr>
-          <w:lang w:val="en-US"/>
-        </w:rPr>
-        <w:t>pelanggan</w:t>
-      </w:r>
-      <w:proofErr w:type="spellEnd"/>
-      <w:r>
-        <w:rPr>
-          <w:lang w:val="en-US"/>
-        </w:rPr>
-        <w:t xml:space="preserve"> pada </w:t>
-      </w:r>
-      <w:proofErr w:type="spellStart"/>
-      <w:r>
-        <w:rPr>
-          <w:lang w:val="en-US"/>
-        </w:rPr>
-        <w:t>sistem</w:t>
-      </w:r>
-      <w:proofErr w:type="spellEnd"/>
-      <w:r>
-        <w:rPr>
-          <w:lang w:val="en-US"/>
-        </w:rPr>
-        <w:t>.</w:t>
+      </w:r>
+      <w:r>
+        <w:rPr>
+          <w:lang w:val="en-US"/>
+        </w:rPr>
+      </w:r>
+      <w:proofErr w:type="spellStart"/>
+      <w:r>
+        <w:rPr>
+          <w:lang w:val="en-US"/>
+        </w:rPr>
+      </w:r>
+      <w:proofErr w:type="spellEnd"/>
+      <w:r>
+        <w:rPr>
+          <w:lang w:val="en-US"/>
+        </w:rPr>
+      </w:r>
+      <w:proofErr w:type="spellStart"/>
+      <w:r>
+        <w:rPr>
+          <w:lang w:val="en-US"/>
+        </w:rPr>
+      </w:r>
+      <w:proofErr w:type="spellEnd"/>
+      <w:r>
+        <w:rPr>
+          <w:lang w:val="en-US"/>
+        </w:rPr>
+      </w:r>
+      <w:proofErr w:type="spellStart"/>
+      <w:r>
+        <w:rPr>
+          <w:lang w:val="en-US"/>
+        </w:rPr>
+      </w:r>
+      <w:proofErr w:type="spellEnd"/>
+      <w:r>
+        <w:rPr>
+          <w:lang w:val="en-US"/>
+        </w:rPr>
+      </w:r>
+      <w:proofErr w:type="spellStart"/>
+      <w:r>
+        <w:rPr>
+          <w:lang w:val="en-US"/>
+        </w:rPr>
+      </w:r>
+      <w:proofErr w:type="spellEnd"/>
+      <w:r>
+        <w:rPr>
+          <w:lang w:val="en-US"/>
+        </w:rPr>
+      </w:r>
+      <w:proofErr w:type="spellStart"/>
+      <w:r>
+        <w:rPr>
+          <w:lang w:val="en-US"/>
+        </w:rPr>
+      </w:r>
+      <w:proofErr w:type="spellEnd"/>
+      <w:r>
+        <w:rPr>
+          <w:lang w:val="en-US"/>
+        </w:rPr>
+      </w:r>
+      <w:proofErr w:type="spellStart"/>
+      <w:r>
+        <w:rPr>
+          <w:lang w:val="en-US"/>
+        </w:rPr>
+      </w:r>
+      <w:proofErr w:type="spellEnd"/>
+      <w:r>
+        <w:rPr>
+          <w:lang w:val="en-US"/>
+        </w:rPr>
+      </w:r>
+      <w:proofErr w:type="spellStart"/>
+      <w:r>
+        <w:rPr>
+          <w:lang w:val="en-US"/>
+        </w:rPr>
+      </w:r>
+      <w:proofErr w:type="spellEnd"/>
+      <w:r>
+        <w:rPr>
+          <w:lang w:val="en-US"/>
+        </w:rPr>
+      </w:r>
+      <w:proofErr w:type="spellStart"/>
+      <w:r>
+        <w:rPr>
+          <w:lang w:val="en-US"/>
+        </w:rPr>
+      </w:r>
+      <w:proofErr w:type="spellEnd"/>
+      <w:r>
+        <w:rPr>
+          <w:lang w:val="en-US"/>
+        </w:rPr>
+      </w:r>
+      <w:proofErr w:type="spellStart"/>
+      <w:r>
+        <w:rPr>
+          <w:lang w:val="en-US"/>
+        </w:rPr>
+      </w:r>
+      <w:proofErr w:type="spellEnd"/>
+      <w:r>
+        <w:rPr>
+          <w:lang w:val="en-US"/>
+        </w:rPr>
+      </w:r>
+      <w:proofErr w:type="spellStart"/>
+      <w:r>
+        <w:rPr>
+          <w:lang w:val="en-US"/>
+        </w:rPr>
+      </w:r>
+      <w:proofErr w:type="spellEnd"/>
+      <w:r>
+        <w:rPr>
+          <w:lang w:val="en-US"/>
+        </w:rPr>
+      </w:r>
+      <w:proofErr w:type="spellStart"/>
+      <w:r>
+        <w:rPr>
+          <w:lang w:val="en-US"/>
+        </w:rPr>
+      </w:r>
+      <w:proofErr w:type="spellEnd"/>
+      <w:r>
+        <w:rPr>
+          <w:lang w:val="en-US"/>
+        </w:rPr>
+      </w:r>
+      <w:proofErr w:type="spellStart"/>
+      <w:r>
+        <w:rPr>
+          <w:lang w:val="en-US"/>
+        </w:rPr>
+      </w:r>
+      <w:proofErr w:type="spellEnd"/>
+      <w:r>
+        <w:rPr>
+          <w:lang w:val="en-US"/>
+        </w:rPr>
+      </w:r>
+      <w:proofErr w:type="spellStart"/>
+      <w:r>
+        <w:rPr>
+          <w:lang w:val="en-US"/>
+        </w:rPr>
+      </w:r>
+      <w:proofErr w:type="spellEnd"/>
+      <w:r>
+        <w:rPr>
+          <w:lang w:val="en-US"/>
+        </w:rPr>
+      </w:r>
+      <w:proofErr w:type="spellStart"/>
+      <w:r>
+        <w:rPr>
+          <w:lang w:val="en-US"/>
+        </w:rPr>
+      </w:r>
+      <w:proofErr w:type="spellEnd"/>
+      <w:r>
+        <w:rPr>
+          <w:lang w:val="en-US"/>
+        </w:rPr>
+      </w:r>
+      <w:proofErr w:type="spellStart"/>
+      <w:r>
+        <w:rPr>
+          <w:lang w:val="en-US"/>
+        </w:rPr>
+      </w:r>
+      <w:proofErr w:type="spellEnd"/>
+      <w:r>
+        <w:rPr>
+          <w:lang w:val="en-US"/>
+        </w:rPr>
+      </w:r>
+      <w:proofErr w:type="spellStart"/>
+      <w:r>
+        <w:rPr>
+          <w:lang w:val="en-US"/>
+        </w:rPr>
+      </w:r>
+      <w:proofErr w:type="spellEnd"/>
+      <w:r>
+        <w:rPr>
+          <w:lang w:val="en-US"/>
+        </w:rPr>
+      </w:r>
+      <w:proofErr w:type="spellStart"/>
+      <w:r>
+        <w:rPr>
+          <w:lang w:val="en-US"/>
+        </w:rPr>
+      </w:r>
+      <w:proofErr w:type="spellEnd"/>
+      <w:r>
+        <w:rPr>
+          <w:lang w:val="en-US"/>
+        </w:rPr>
+      </w:r>
+      <w:proofErr w:type="spellStart"/>
+      <w:r>
+        <w:rPr>
+          <w:lang w:val="en-US"/>
+        </w:rPr>
+      </w:r>
+      <w:proofErr w:type="spellEnd"/>
+      <w:r>
+        <w:rPr>
+          <w:lang w:val="en-US"/>
+        </w:rPr>
+      </w:r>
+      <w:proofErr w:type="spellStart"/>
+      <w:r>
+        <w:rPr>
+          <w:lang w:val="en-US"/>
+        </w:rPr>
+      </w:r>
+      <w:proofErr w:type="spellEnd"/>
+      <w:r>
+        <w:rPr>
+          <w:lang w:val="en-US"/>
+        </w:rPr>
+      </w:r>
+      <w:proofErr w:type="spellStart"/>
+      <w:r>
+        <w:rPr>
+          <w:lang w:val="en-US"/>
+        </w:rPr>
+      </w:r>
+      <w:proofErr w:type="spellEnd"/>
+      <w:r>
+        <w:rPr>
+          <w:lang w:val="en-US"/>
+        </w:rPr>
+      </w:r>
+      <w:proofErr w:type="spellStart"/>
+      <w:r>
+        <w:rPr>
+          <w:lang w:val="en-US"/>
+        </w:rPr>
+      </w:r>
+      <w:proofErr w:type="spellEnd"/>
+      <w:r>
+        <w:rPr>
+          <w:lang w:val="en-US"/>
+        </w:rPr>
       </w:r>
     </w:p>
     <w:p>
@@ -31863,7 +31752,7 @@
                 <w:szCs w:val="24"/>
                 <w:lang w:val="en-ID"/>
               </w:rPr>
-              <w:t>0.00 – 0.33</w:t>
+              <w:t>≤ P33,33</w:t>
             </w:r>
           </w:p>
         </w:tc>
@@ -31898,7 +31787,7 @@
                 <w:szCs w:val="24"/>
                 <w:lang w:val="en-ID"/>
               </w:rPr>
-              <w:t>0.67 – 1.00</w:t>
+              <w:t>&gt; P66,67</w:t>
             </w:r>
           </w:p>
         </w:tc>
@@ -31933,7 +31822,7 @@
                 <w:szCs w:val="24"/>
                 <w:lang w:val="en-ID"/>
               </w:rPr>
-              <w:t>0.67 – 1.00</w:t>
+              <w:t>&gt; P66,67</w:t>
             </w:r>
           </w:p>
         </w:tc>
@@ -32009,7 +31898,7 @@
                 <w:szCs w:val="24"/>
                 <w:lang w:val="en-ID"/>
               </w:rPr>
-              <w:t>0.34 – 0.66</w:t>
+              <w:t>P33,33 – P66,67</w:t>
             </w:r>
           </w:p>
         </w:tc>
@@ -32044,7 +31933,7 @@
                 <w:szCs w:val="24"/>
                 <w:lang w:val="en-ID"/>
               </w:rPr>
-              <w:t>0.34 – 0.66</w:t>
+              <w:t>P33,33 – P66,67</w:t>
             </w:r>
           </w:p>
         </w:tc>
@@ -32079,7 +31968,7 @@
                 <w:szCs w:val="24"/>
                 <w:lang w:val="en-ID"/>
               </w:rPr>
-              <w:t>0.34 – 0.66</w:t>
+              <w:t>P33,33 – P66,67</w:t>
             </w:r>
           </w:p>
         </w:tc>
@@ -32157,7 +32046,7 @@
                 <w:szCs w:val="24"/>
                 <w:lang w:val="en-ID"/>
               </w:rPr>
-              <w:t>0.67 – 1.00</w:t>
+              <w:t>&gt; P66,67</w:t>
             </w:r>
           </w:p>
         </w:tc>
@@ -32192,7 +32081,7 @@
                 <w:szCs w:val="24"/>
                 <w:lang w:val="en-ID"/>
               </w:rPr>
-              <w:t>0.00 – 0.33</w:t>
+              <w:t>≤ P33,33</w:t>
             </w:r>
           </w:p>
         </w:tc>
@@ -32227,7 +32116,7 @@
                 <w:szCs w:val="24"/>
                 <w:lang w:val="en-ID"/>
               </w:rPr>
-              <w:t>0.00 – 0.33</w:t>
+              <w:t>≤ P33,33</w:t>
             </w:r>
           </w:p>
         </w:tc>
@@ -35860,112 +35749,97 @@
         <w:rPr>
           <w:lang w:val="en-US"/>
         </w:rPr>
-        <w:t>Tahap</w:t>
-      </w:r>
-      <w:proofErr w:type="spellEnd"/>
-      <w:r>
-        <w:rPr>
-          <w:lang w:val="en-US"/>
-        </w:rPr>
-        <w:t xml:space="preserve"> </w:t>
-      </w:r>
-      <w:proofErr w:type="spellStart"/>
-      <w:r>
-        <w:rPr>
-          <w:lang w:val="en-US"/>
-        </w:rPr>
-        <w:t>implementasi</w:t>
-      </w:r>
-      <w:proofErr w:type="spellEnd"/>
-      <w:r>
-        <w:rPr>
-          <w:lang w:val="en-US"/>
-        </w:rPr>
-        <w:t xml:space="preserve"> </w:t>
-      </w:r>
-      <w:proofErr w:type="spellStart"/>
-      <w:r>
-        <w:rPr>
-          <w:lang w:val="en-US"/>
-        </w:rPr>
-        <w:t>dilakukan</w:t>
-      </w:r>
-      <w:proofErr w:type="spellEnd"/>
-      <w:r>
-        <w:rPr>
-          <w:lang w:val="en-US"/>
-        </w:rPr>
-        <w:t xml:space="preserve"> </w:t>
-      </w:r>
-      <w:proofErr w:type="spellStart"/>
-      <w:r>
-        <w:rPr>
-          <w:lang w:val="en-US"/>
-        </w:rPr>
-        <w:t>dengan</w:t>
-      </w:r>
-      <w:proofErr w:type="spellEnd"/>
-      <w:r>
-        <w:rPr>
-          <w:lang w:val="en-US"/>
-        </w:rPr>
-        <w:t xml:space="preserve"> </w:t>
-      </w:r>
-      <w:proofErr w:type="spellStart"/>
-      <w:r>
-        <w:rPr>
-          <w:lang w:val="en-US"/>
-        </w:rPr>
-        <w:t>membangun</w:t>
-      </w:r>
-      <w:proofErr w:type="spellEnd"/>
-      <w:r>
-        <w:rPr>
-          <w:lang w:val="en-US"/>
-        </w:rPr>
-        <w:t xml:space="preserve"> </w:t>
-      </w:r>
-      <w:proofErr w:type="spellStart"/>
-      <w:r>
-        <w:rPr>
-          <w:lang w:val="en-US"/>
-        </w:rPr>
-        <w:t>sistem</w:t>
-      </w:r>
-      <w:proofErr w:type="spellEnd"/>
-      <w:r>
-        <w:rPr>
-          <w:lang w:val="en-US"/>
-        </w:rPr>
-        <w:t xml:space="preserve"> </w:t>
-      </w:r>
-      <w:proofErr w:type="spellStart"/>
-      <w:r>
-        <w:rPr>
-          <w:lang w:val="en-US"/>
-        </w:rPr>
-        <w:t>berbasis</w:t>
-      </w:r>
-      <w:proofErr w:type="spellEnd"/>
-      <w:r>
-        <w:rPr>
-          <w:lang w:val="en-US"/>
-        </w:rPr>
-        <w:t xml:space="preserve"> web </w:t>
-      </w:r>
-      <w:proofErr w:type="spellStart"/>
-      <w:r>
-        <w:rPr>
-          <w:lang w:val="en-US"/>
-        </w:rPr>
-        <w:t>menggunakan</w:t>
-      </w:r>
-      <w:proofErr w:type="spellEnd"/>
-      <w:r>
-        <w:rPr>
-          <w:lang w:val="en-US"/>
-        </w:rPr>
-        <w:t xml:space="preserve"> </w:t>
+        <w:t>Tahap implementasi dilakukan dengan membangun sistem berbasis web menggunakan bahasa pemrograman Python dengan framework Flask dan basis data MySQL. Sistem yang telah dibangun kemudian diuji menggunakan Black-Box Testing dengan teknik Equivalence Partitioning untuk memastikan seluruh fungsi sistem berjalan dengan baik. Pengujian dilakukan pada fitur pengelolaan data pelanggan, data transaksi, perhitungan RFM, proses clustering K-Means, serta penyajian hasil segmentasi pelanggan. Model K-Means yang telah dilatih disimpan dalam format JSON berisi skala normalisasi dan posisi sentroid, sehingga sistem dapat menilai pelanggan baru tanpa perlu melatih ulang model. Sistem melakukan pelatihan ulang (retrain) hanya ketika salah satu ambang batas berikut terpenuhi: penambahan data sebesar 10% dari jumlah data latih, Silhouette Score di bawah 0,35, lebih dari 10% nilai pelanggan berada di luar rentang skaler model (drift), atau usia model lebih dari 90 hari.</w:t>
+      </w:r>
+      <w:proofErr w:type="spellEnd"/>
+      <w:r>
+        <w:rPr>
+          <w:lang w:val="en-US"/>
+        </w:rPr>
+      </w:r>
+      <w:proofErr w:type="spellStart"/>
+      <w:r>
+        <w:rPr>
+          <w:lang w:val="en-US"/>
+        </w:rPr>
+      </w:r>
+      <w:proofErr w:type="spellEnd"/>
+      <w:r>
+        <w:rPr>
+          <w:lang w:val="en-US"/>
+        </w:rPr>
+      </w:r>
+      <w:proofErr w:type="spellStart"/>
+      <w:r>
+        <w:rPr>
+          <w:lang w:val="en-US"/>
+        </w:rPr>
+      </w:r>
+      <w:proofErr w:type="spellEnd"/>
+      <w:r>
+        <w:rPr>
+          <w:lang w:val="en-US"/>
+        </w:rPr>
+      </w:r>
+      <w:proofErr w:type="spellStart"/>
+      <w:r>
+        <w:rPr>
+          <w:lang w:val="en-US"/>
+        </w:rPr>
+      </w:r>
+      <w:proofErr w:type="spellEnd"/>
+      <w:r>
+        <w:rPr>
+          <w:lang w:val="en-US"/>
+        </w:rPr>
+      </w:r>
+      <w:proofErr w:type="spellStart"/>
+      <w:r>
+        <w:rPr>
+          <w:lang w:val="en-US"/>
+        </w:rPr>
+      </w:r>
+      <w:proofErr w:type="spellEnd"/>
+      <w:r>
+        <w:rPr>
+          <w:lang w:val="en-US"/>
+        </w:rPr>
+      </w:r>
+      <w:proofErr w:type="spellStart"/>
+      <w:r>
+        <w:rPr>
+          <w:lang w:val="en-US"/>
+        </w:rPr>
+      </w:r>
+      <w:proofErr w:type="spellEnd"/>
+      <w:r>
+        <w:rPr>
+          <w:lang w:val="en-US"/>
+        </w:rPr>
+      </w:r>
+      <w:proofErr w:type="spellStart"/>
+      <w:r>
+        <w:rPr>
+          <w:lang w:val="en-US"/>
+        </w:rPr>
+      </w:r>
+      <w:proofErr w:type="spellEnd"/>
+      <w:r>
+        <w:rPr>
+          <w:lang w:val="en-US"/>
+        </w:rPr>
+      </w:r>
+      <w:proofErr w:type="spellStart"/>
+      <w:r>
+        <w:rPr>
+          <w:lang w:val="en-US"/>
+        </w:rPr>
+      </w:r>
+      <w:proofErr w:type="spellEnd"/>
+      <w:r>
+        <w:rPr>
+          <w:lang w:val="en-US"/>
+        </w:rPr>
       </w:r>
       <w:r>
         <w:rPr>
@@ -35973,27 +35847,23 @@
           <w:iCs/>
           <w:lang w:val="en-US"/>
         </w:rPr>
-        <w:t>PHP</w:t>
-      </w:r>
-      <w:r>
-        <w:rPr>
-          <w:lang w:val="en-US"/>
-        </w:rPr>
-        <w:t xml:space="preserve"> </w:t>
-      </w:r>
-      <w:proofErr w:type="spellStart"/>
-      <w:r>
-        <w:rPr>
-          <w:lang w:val="en-US"/>
-        </w:rPr>
-        <w:t>dengan</w:t>
-      </w:r>
-      <w:proofErr w:type="spellEnd"/>
-      <w:r>
-        <w:rPr>
-          <w:lang w:val="en-US"/>
-        </w:rPr>
-        <w:t xml:space="preserve"> </w:t>
+      </w:r>
+      <w:r>
+        <w:rPr>
+          <w:lang w:val="en-US"/>
+        </w:rPr>
+      </w:r>
+      <w:proofErr w:type="spellStart"/>
+      <w:r>
+        <w:rPr>
+          <w:lang w:val="en-US"/>
+        </w:rPr>
+      </w:r>
+      <w:proofErr w:type="spellEnd"/>
+      <w:r>
+        <w:rPr>
+          <w:lang w:val="en-US"/>
+        </w:rPr>
       </w:r>
       <w:r>
         <w:rPr>
@@ -36001,13 +35871,11 @@
           <w:iCs/>
           <w:lang w:val="en-US"/>
         </w:rPr>
-        <w:t>framework Laravel</w:t>
-      </w:r>
-      <w:r>
-        <w:rPr>
-          <w:lang w:val="en-US"/>
-        </w:rPr>
-        <w:t xml:space="preserve"> dan basis data </w:t>
+      </w:r>
+      <w:r>
+        <w:rPr>
+          <w:lang w:val="en-US"/>
+        </w:rPr>
       </w:r>
       <w:r>
         <w:rPr>
@@ -36015,97 +35883,83 @@
           <w:iCs/>
           <w:lang w:val="en-US"/>
         </w:rPr>
-        <w:t>MySQL</w:t>
-      </w:r>
-      <w:r>
-        <w:rPr>
-          <w:lang w:val="en-US"/>
-        </w:rPr>
-        <w:t xml:space="preserve">. </w:t>
-      </w:r>
-      <w:proofErr w:type="spellStart"/>
-      <w:r>
-        <w:rPr>
-          <w:lang w:val="en-US"/>
-        </w:rPr>
-        <w:t>Sistem</w:t>
-      </w:r>
-      <w:proofErr w:type="spellEnd"/>
-      <w:r>
-        <w:rPr>
-          <w:lang w:val="en-US"/>
-        </w:rPr>
-        <w:t xml:space="preserve"> yang </w:t>
-      </w:r>
-      <w:proofErr w:type="spellStart"/>
-      <w:r>
-        <w:rPr>
-          <w:lang w:val="en-US"/>
-        </w:rPr>
-        <w:t>telah</w:t>
-      </w:r>
-      <w:proofErr w:type="spellEnd"/>
-      <w:r>
-        <w:rPr>
-          <w:lang w:val="en-US"/>
-        </w:rPr>
-        <w:t xml:space="preserve"> </w:t>
-      </w:r>
-      <w:proofErr w:type="spellStart"/>
-      <w:r>
-        <w:rPr>
-          <w:lang w:val="en-US"/>
-        </w:rPr>
-        <w:t>dibangun</w:t>
-      </w:r>
-      <w:proofErr w:type="spellEnd"/>
-      <w:r>
-        <w:rPr>
-          <w:lang w:val="en-US"/>
-        </w:rPr>
-        <w:t xml:space="preserve"> </w:t>
-      </w:r>
-      <w:proofErr w:type="spellStart"/>
-      <w:r>
-        <w:rPr>
-          <w:lang w:val="en-US"/>
-        </w:rPr>
-        <w:t>kemudian</w:t>
-      </w:r>
-      <w:proofErr w:type="spellEnd"/>
-      <w:r>
-        <w:rPr>
-          <w:lang w:val="en-US"/>
-        </w:rPr>
-        <w:t xml:space="preserve"> </w:t>
-      </w:r>
-      <w:proofErr w:type="spellStart"/>
-      <w:r>
-        <w:rPr>
-          <w:lang w:val="en-US"/>
-        </w:rPr>
-        <w:t>diuji</w:t>
-      </w:r>
-      <w:proofErr w:type="spellEnd"/>
-      <w:r>
-        <w:rPr>
-          <w:lang w:val="en-US"/>
-        </w:rPr>
-        <w:t xml:space="preserve"> </w:t>
-      </w:r>
-      <w:proofErr w:type="spellStart"/>
-      <w:r>
-        <w:rPr>
-          <w:lang w:val="en-US"/>
-        </w:rPr>
-        <w:t>menggunakan</w:t>
-      </w:r>
-      <w:proofErr w:type="spellEnd"/>
-      <w:r>
-        <w:rPr>
-          <w:lang w:val="en-US"/>
-        </w:rPr>
-        <w:t xml:space="preserve"> </w:t>
+      </w:r>
+      <w:r>
+        <w:rPr>
+          <w:lang w:val="en-US"/>
+        </w:rPr>
+      </w:r>
+      <w:proofErr w:type="spellStart"/>
+      <w:r>
+        <w:rPr>
+          <w:lang w:val="en-US"/>
+        </w:rPr>
+      </w:r>
+      <w:proofErr w:type="spellEnd"/>
+      <w:r>
+        <w:rPr>
+          <w:lang w:val="en-US"/>
+        </w:rPr>
+      </w:r>
+      <w:proofErr w:type="spellStart"/>
+      <w:r>
+        <w:rPr>
+          <w:lang w:val="en-US"/>
+        </w:rPr>
+      </w:r>
+      <w:proofErr w:type="spellEnd"/>
+      <w:r>
+        <w:rPr>
+          <w:lang w:val="en-US"/>
+        </w:rPr>
+      </w:r>
+      <w:proofErr w:type="spellStart"/>
+      <w:r>
+        <w:rPr>
+          <w:lang w:val="en-US"/>
+        </w:rPr>
+      </w:r>
+      <w:proofErr w:type="spellEnd"/>
+      <w:r>
+        <w:rPr>
+          <w:lang w:val="en-US"/>
+        </w:rPr>
+      </w:r>
+      <w:proofErr w:type="spellStart"/>
+      <w:r>
+        <w:rPr>
+          <w:lang w:val="en-US"/>
+        </w:rPr>
+      </w:r>
+      <w:proofErr w:type="spellEnd"/>
+      <w:r>
+        <w:rPr>
+          <w:lang w:val="en-US"/>
+        </w:rPr>
+      </w:r>
+      <w:proofErr w:type="spellStart"/>
+      <w:r>
+        <w:rPr>
+          <w:lang w:val="en-US"/>
+        </w:rPr>
+      </w:r>
+      <w:proofErr w:type="spellEnd"/>
+      <w:r>
+        <w:rPr>
+          <w:lang w:val="en-US"/>
+        </w:rPr>
+      </w:r>
+      <w:proofErr w:type="spellStart"/>
+      <w:r>
+        <w:rPr>
+          <w:lang w:val="en-US"/>
+        </w:rPr>
+      </w:r>
+      <w:proofErr w:type="spellEnd"/>
+      <w:r>
+        <w:rPr>
+          <w:lang w:val="en-US"/>
+        </w:rPr>
       </w:r>
       <w:r>
         <w:rPr>
@@ -36113,41 +35967,35 @@
           <w:iCs/>
           <w:lang w:val="en-US"/>
         </w:rPr>
-        <w:t>Black-Box Testing</w:t>
-      </w:r>
-      <w:r>
-        <w:rPr>
-          <w:lang w:val="en-US"/>
-        </w:rPr>
-        <w:t xml:space="preserve"> </w:t>
-      </w:r>
-      <w:proofErr w:type="spellStart"/>
-      <w:r>
-        <w:rPr>
-          <w:lang w:val="en-US"/>
-        </w:rPr>
-        <w:t>dengan</w:t>
-      </w:r>
-      <w:proofErr w:type="spellEnd"/>
-      <w:r>
-        <w:rPr>
-          <w:lang w:val="en-US"/>
-        </w:rPr>
-        <w:t xml:space="preserve"> </w:t>
-      </w:r>
-      <w:proofErr w:type="spellStart"/>
-      <w:r>
-        <w:rPr>
-          <w:lang w:val="en-US"/>
-        </w:rPr>
-        <w:t>teknik</w:t>
-      </w:r>
-      <w:proofErr w:type="spellEnd"/>
-      <w:r>
-        <w:rPr>
-          <w:lang w:val="en-US"/>
-        </w:rPr>
-        <w:t xml:space="preserve"> </w:t>
+      </w:r>
+      <w:r>
+        <w:rPr>
+          <w:lang w:val="en-US"/>
+        </w:rPr>
+      </w:r>
+      <w:proofErr w:type="spellStart"/>
+      <w:r>
+        <w:rPr>
+          <w:lang w:val="en-US"/>
+        </w:rPr>
+      </w:r>
+      <w:proofErr w:type="spellEnd"/>
+      <w:r>
+        <w:rPr>
+          <w:lang w:val="en-US"/>
+        </w:rPr>
+      </w:r>
+      <w:proofErr w:type="spellStart"/>
+      <w:r>
+        <w:rPr>
+          <w:lang w:val="en-US"/>
+        </w:rPr>
+      </w:r>
+      <w:proofErr w:type="spellEnd"/>
+      <w:r>
+        <w:rPr>
+          <w:lang w:val="en-US"/>
+        </w:rPr>
       </w:r>
       <w:r>
         <w:rPr>
@@ -36155,224 +36003,191 @@
           <w:iCs/>
           <w:lang w:val="en-US"/>
         </w:rPr>
-        <w:lastRenderedPageBreak/>
-        <w:t>Equivalence Partitioning</w:t>
-      </w:r>
-      <w:r>
-        <w:rPr>
-          <w:lang w:val="en-US"/>
-        </w:rPr>
-        <w:t xml:space="preserve"> </w:t>
-      </w:r>
-      <w:proofErr w:type="spellStart"/>
-      <w:r>
-        <w:rPr>
-          <w:lang w:val="en-US"/>
-        </w:rPr>
-        <w:t>untuk</w:t>
-      </w:r>
-      <w:proofErr w:type="spellEnd"/>
-      <w:r>
-        <w:rPr>
-          <w:lang w:val="en-US"/>
-        </w:rPr>
-        <w:t xml:space="preserve"> </w:t>
-      </w:r>
-      <w:proofErr w:type="spellStart"/>
-      <w:r>
-        <w:rPr>
-          <w:lang w:val="en-US"/>
-        </w:rPr>
-        <w:t>memastikan</w:t>
-      </w:r>
-      <w:proofErr w:type="spellEnd"/>
-      <w:r>
-        <w:rPr>
-          <w:lang w:val="en-US"/>
-        </w:rPr>
-        <w:t xml:space="preserve"> </w:t>
-      </w:r>
-      <w:proofErr w:type="spellStart"/>
-      <w:r>
-        <w:rPr>
-          <w:lang w:val="en-US"/>
-        </w:rPr>
-        <w:t>seluruh</w:t>
-      </w:r>
-      <w:proofErr w:type="spellEnd"/>
-      <w:r>
-        <w:rPr>
-          <w:lang w:val="en-US"/>
-        </w:rPr>
-        <w:t xml:space="preserve"> </w:t>
-      </w:r>
-      <w:proofErr w:type="spellStart"/>
-      <w:r>
-        <w:rPr>
-          <w:lang w:val="en-US"/>
-        </w:rPr>
-        <w:t>fungsi</w:t>
-      </w:r>
-      <w:proofErr w:type="spellEnd"/>
-      <w:r>
-        <w:rPr>
-          <w:lang w:val="en-US"/>
-        </w:rPr>
-        <w:t xml:space="preserve"> </w:t>
-      </w:r>
-      <w:proofErr w:type="spellStart"/>
-      <w:r>
-        <w:rPr>
-          <w:lang w:val="en-US"/>
-        </w:rPr>
-        <w:t>sistem</w:t>
-      </w:r>
-      <w:proofErr w:type="spellEnd"/>
-      <w:r>
-        <w:rPr>
-          <w:lang w:val="en-US"/>
-        </w:rPr>
-        <w:t xml:space="preserve"> </w:t>
-      </w:r>
-      <w:proofErr w:type="spellStart"/>
-      <w:r>
-        <w:rPr>
-          <w:lang w:val="en-US"/>
-        </w:rPr>
-        <w:t>berjalan</w:t>
-      </w:r>
-      <w:proofErr w:type="spellEnd"/>
-      <w:r>
-        <w:rPr>
-          <w:lang w:val="en-US"/>
-        </w:rPr>
-        <w:t xml:space="preserve"> </w:t>
-      </w:r>
-      <w:proofErr w:type="spellStart"/>
-      <w:r>
-        <w:rPr>
-          <w:lang w:val="en-US"/>
-        </w:rPr>
-        <w:t>dengan</w:t>
-      </w:r>
-      <w:proofErr w:type="spellEnd"/>
-      <w:r>
-        <w:rPr>
-          <w:lang w:val="en-US"/>
-        </w:rPr>
-        <w:t xml:space="preserve"> </w:t>
-      </w:r>
-      <w:proofErr w:type="spellStart"/>
-      <w:r>
-        <w:rPr>
-          <w:lang w:val="en-US"/>
-        </w:rPr>
-        <w:t>baik</w:t>
-      </w:r>
-      <w:proofErr w:type="spellEnd"/>
-      <w:r>
-        <w:rPr>
-          <w:lang w:val="en-US"/>
-        </w:rPr>
-        <w:t xml:space="preserve">. </w:t>
-      </w:r>
-      <w:proofErr w:type="spellStart"/>
-      <w:r>
-        <w:rPr>
-          <w:lang w:val="en-US"/>
-        </w:rPr>
-        <w:t>Pengujian</w:t>
-      </w:r>
-      <w:proofErr w:type="spellEnd"/>
-      <w:r>
-        <w:rPr>
-          <w:lang w:val="en-US"/>
-        </w:rPr>
-        <w:t xml:space="preserve"> </w:t>
-      </w:r>
-      <w:proofErr w:type="spellStart"/>
-      <w:r>
-        <w:rPr>
-          <w:lang w:val="en-US"/>
-        </w:rPr>
-        <w:t>dilakukan</w:t>
-      </w:r>
-      <w:proofErr w:type="spellEnd"/>
-      <w:r>
-        <w:rPr>
-          <w:lang w:val="en-US"/>
-        </w:rPr>
-        <w:t xml:space="preserve"> pada </w:t>
-      </w:r>
-      <w:proofErr w:type="spellStart"/>
-      <w:r>
-        <w:rPr>
-          <w:lang w:val="en-US"/>
-        </w:rPr>
-        <w:t>fitur</w:t>
-      </w:r>
-      <w:proofErr w:type="spellEnd"/>
-      <w:r>
-        <w:rPr>
-          <w:lang w:val="en-US"/>
-        </w:rPr>
-        <w:t xml:space="preserve"> </w:t>
-      </w:r>
-      <w:proofErr w:type="spellStart"/>
-      <w:r>
-        <w:rPr>
-          <w:lang w:val="en-US"/>
-        </w:rPr>
-        <w:t>pengelolaan</w:t>
-      </w:r>
-      <w:proofErr w:type="spellEnd"/>
-      <w:r>
-        <w:rPr>
-          <w:lang w:val="en-US"/>
-        </w:rPr>
-        <w:t xml:space="preserve"> data </w:t>
-      </w:r>
-      <w:proofErr w:type="spellStart"/>
-      <w:r>
-        <w:rPr>
-          <w:lang w:val="en-US"/>
-        </w:rPr>
-        <w:t>pelanggan</w:t>
-      </w:r>
-      <w:proofErr w:type="spellEnd"/>
-      <w:r>
-        <w:rPr>
-          <w:lang w:val="en-US"/>
-        </w:rPr>
-        <w:t xml:space="preserve">, data </w:t>
-      </w:r>
-      <w:proofErr w:type="spellStart"/>
-      <w:r>
-        <w:rPr>
-          <w:lang w:val="en-US"/>
-        </w:rPr>
-        <w:t>transaksi</w:t>
-      </w:r>
-      <w:proofErr w:type="spellEnd"/>
-      <w:r>
-        <w:rPr>
-          <w:lang w:val="en-US"/>
-        </w:rPr>
-        <w:t xml:space="preserve">, </w:t>
-      </w:r>
-      <w:proofErr w:type="spellStart"/>
-      <w:r>
-        <w:rPr>
-          <w:lang w:val="en-US"/>
-        </w:rPr>
-        <w:t>perhitungan</w:t>
-      </w:r>
-      <w:proofErr w:type="spellEnd"/>
-      <w:r>
-        <w:rPr>
-          <w:lang w:val="en-US"/>
-        </w:rPr>
-        <w:t xml:space="preserve"> </w:t>
+      </w:r>
+      <w:r>
+        <w:rPr>
+          <w:lang w:val="en-US"/>
+        </w:rPr>
+      </w:r>
+      <w:proofErr w:type="spellStart"/>
+      <w:r>
+        <w:rPr>
+          <w:lang w:val="en-US"/>
+        </w:rPr>
+      </w:r>
+      <w:proofErr w:type="spellEnd"/>
+      <w:r>
+        <w:rPr>
+          <w:lang w:val="en-US"/>
+        </w:rPr>
+      </w:r>
+      <w:proofErr w:type="spellStart"/>
+      <w:r>
+        <w:rPr>
+          <w:lang w:val="en-US"/>
+        </w:rPr>
+      </w:r>
+      <w:proofErr w:type="spellEnd"/>
+      <w:r>
+        <w:rPr>
+          <w:lang w:val="en-US"/>
+        </w:rPr>
+      </w:r>
+      <w:proofErr w:type="spellStart"/>
+      <w:r>
+        <w:rPr>
+          <w:lang w:val="en-US"/>
+        </w:rPr>
+      </w:r>
+      <w:proofErr w:type="spellEnd"/>
+      <w:r>
+        <w:rPr>
+          <w:lang w:val="en-US"/>
+        </w:rPr>
+      </w:r>
+      <w:proofErr w:type="spellStart"/>
+      <w:r>
+        <w:rPr>
+          <w:lang w:val="en-US"/>
+        </w:rPr>
+      </w:r>
+      <w:proofErr w:type="spellEnd"/>
+      <w:r>
+        <w:rPr>
+          <w:lang w:val="en-US"/>
+        </w:rPr>
+      </w:r>
+      <w:proofErr w:type="spellStart"/>
+      <w:r>
+        <w:rPr>
+          <w:lang w:val="en-US"/>
+        </w:rPr>
+      </w:r>
+      <w:proofErr w:type="spellEnd"/>
+      <w:r>
+        <w:rPr>
+          <w:lang w:val="en-US"/>
+        </w:rPr>
+      </w:r>
+      <w:proofErr w:type="spellStart"/>
+      <w:r>
+        <w:rPr>
+          <w:lang w:val="en-US"/>
+        </w:rPr>
+      </w:r>
+      <w:proofErr w:type="spellEnd"/>
+      <w:r>
+        <w:rPr>
+          <w:lang w:val="en-US"/>
+        </w:rPr>
+      </w:r>
+      <w:proofErr w:type="spellStart"/>
+      <w:r>
+        <w:rPr>
+          <w:lang w:val="en-US"/>
+        </w:rPr>
+      </w:r>
+      <w:proofErr w:type="spellEnd"/>
+      <w:r>
+        <w:rPr>
+          <w:lang w:val="en-US"/>
+        </w:rPr>
+      </w:r>
+      <w:proofErr w:type="spellStart"/>
+      <w:r>
+        <w:rPr>
+          <w:lang w:val="en-US"/>
+        </w:rPr>
+      </w:r>
+      <w:proofErr w:type="spellEnd"/>
+      <w:r>
+        <w:rPr>
+          <w:lang w:val="en-US"/>
+        </w:rPr>
+      </w:r>
+      <w:proofErr w:type="spellStart"/>
+      <w:r>
+        <w:rPr>
+          <w:lang w:val="en-US"/>
+        </w:rPr>
+      </w:r>
+      <w:proofErr w:type="spellEnd"/>
+      <w:r>
+        <w:rPr>
+          <w:lang w:val="en-US"/>
+        </w:rPr>
+      </w:r>
+      <w:proofErr w:type="spellStart"/>
+      <w:r>
+        <w:rPr>
+          <w:lang w:val="en-US"/>
+        </w:rPr>
+      </w:r>
+      <w:proofErr w:type="spellEnd"/>
+      <w:r>
+        <w:rPr>
+          <w:lang w:val="en-US"/>
+        </w:rPr>
+      </w:r>
+      <w:proofErr w:type="spellStart"/>
+      <w:r>
+        <w:rPr>
+          <w:lang w:val="en-US"/>
+        </w:rPr>
+      </w:r>
+      <w:proofErr w:type="spellEnd"/>
+      <w:r>
+        <w:rPr>
+          <w:lang w:val="en-US"/>
+        </w:rPr>
+      </w:r>
+      <w:proofErr w:type="spellStart"/>
+      <w:r>
+        <w:rPr>
+          <w:lang w:val="en-US"/>
+        </w:rPr>
+      </w:r>
+      <w:proofErr w:type="spellEnd"/>
+      <w:r>
+        <w:rPr>
+          <w:lang w:val="en-US"/>
+        </w:rPr>
+      </w:r>
+      <w:proofErr w:type="spellStart"/>
+      <w:r>
+        <w:rPr>
+          <w:lang w:val="en-US"/>
+        </w:rPr>
+      </w:r>
+      <w:proofErr w:type="spellEnd"/>
+      <w:r>
+        <w:rPr>
+          <w:lang w:val="en-US"/>
+        </w:rPr>
+      </w:r>
+      <w:proofErr w:type="spellStart"/>
+      <w:r>
+        <w:rPr>
+          <w:lang w:val="en-US"/>
+        </w:rPr>
+      </w:r>
+      <w:proofErr w:type="spellEnd"/>
+      <w:r>
+        <w:rPr>
+          <w:lang w:val="en-US"/>
+        </w:rPr>
+      </w:r>
+      <w:proofErr w:type="spellStart"/>
+      <w:r>
+        <w:rPr>
+          <w:lang w:val="en-US"/>
+        </w:rPr>
+      </w:r>
+      <w:proofErr w:type="spellEnd"/>
+      <w:r>
+        <w:rPr>
+          <w:lang w:val="en-US"/>
+        </w:rPr>
       </w:r>
       <w:r>
         <w:rPr>
@@ -36380,13 +36195,11 @@
           <w:iCs/>
           <w:lang w:val="en-US"/>
         </w:rPr>
-        <w:t>RFM</w:t>
-      </w:r>
-      <w:r>
-        <w:rPr>
-          <w:lang w:val="en-US"/>
-        </w:rPr>
-        <w:t xml:space="preserve">, proses clustering </w:t>
+      </w:r>
+      <w:r>
+        <w:rPr>
+          <w:lang w:val="en-US"/>
+        </w:rPr>
       </w:r>
       <w:r>
         <w:rPr>
@@ -36394,83 +36207,71 @@
           <w:iCs/>
           <w:lang w:val="en-US"/>
         </w:rPr>
-        <w:t>K-Means</w:t>
-      </w:r>
-      <w:r>
-        <w:rPr>
-          <w:lang w:val="en-US"/>
-        </w:rPr>
-        <w:t xml:space="preserve">, </w:t>
-      </w:r>
-      <w:proofErr w:type="spellStart"/>
-      <w:r>
-        <w:rPr>
-          <w:lang w:val="en-US"/>
-        </w:rPr>
-        <w:t>serta</w:t>
-      </w:r>
-      <w:proofErr w:type="spellEnd"/>
-      <w:r>
-        <w:rPr>
-          <w:lang w:val="en-US"/>
-        </w:rPr>
-        <w:t xml:space="preserve"> </w:t>
-      </w:r>
-      <w:proofErr w:type="spellStart"/>
-      <w:r>
-        <w:rPr>
-          <w:lang w:val="en-US"/>
-        </w:rPr>
-        <w:t>penyajian</w:t>
-      </w:r>
-      <w:proofErr w:type="spellEnd"/>
-      <w:r>
-        <w:rPr>
-          <w:lang w:val="en-US"/>
-        </w:rPr>
-        <w:t xml:space="preserve"> </w:t>
-      </w:r>
-      <w:proofErr w:type="spellStart"/>
-      <w:r>
-        <w:rPr>
-          <w:lang w:val="en-US"/>
-        </w:rPr>
-        <w:t>hasil</w:t>
-      </w:r>
-      <w:proofErr w:type="spellEnd"/>
-      <w:r>
-        <w:rPr>
-          <w:lang w:val="en-US"/>
-        </w:rPr>
-        <w:t xml:space="preserve"> </w:t>
-      </w:r>
-      <w:proofErr w:type="spellStart"/>
-      <w:r>
-        <w:rPr>
-          <w:lang w:val="en-US"/>
-        </w:rPr>
-        <w:t>segmentasi</w:t>
-      </w:r>
-      <w:proofErr w:type="spellEnd"/>
-      <w:r>
-        <w:rPr>
-          <w:lang w:val="en-US"/>
-        </w:rPr>
-        <w:t xml:space="preserve"> </w:t>
-      </w:r>
-      <w:proofErr w:type="spellStart"/>
-      <w:r>
-        <w:rPr>
-          <w:lang w:val="en-US"/>
-        </w:rPr>
-        <w:t>pelanggan</w:t>
-      </w:r>
-      <w:proofErr w:type="spellEnd"/>
-      <w:r>
-        <w:rPr>
-          <w:lang w:val="en-US"/>
-        </w:rPr>
-        <w:t>.</w:t>
+      </w:r>
+      <w:r>
+        <w:rPr>
+          <w:lang w:val="en-US"/>
+        </w:rPr>
+      </w:r>
+      <w:proofErr w:type="spellStart"/>
+      <w:r>
+        <w:rPr>
+          <w:lang w:val="en-US"/>
+        </w:rPr>
+      </w:r>
+      <w:proofErr w:type="spellEnd"/>
+      <w:r>
+        <w:rPr>
+          <w:lang w:val="en-US"/>
+        </w:rPr>
+      </w:r>
+      <w:proofErr w:type="spellStart"/>
+      <w:r>
+        <w:rPr>
+          <w:lang w:val="en-US"/>
+        </w:rPr>
+      </w:r>
+      <w:proofErr w:type="spellEnd"/>
+      <w:r>
+        <w:rPr>
+          <w:lang w:val="en-US"/>
+        </w:rPr>
+      </w:r>
+      <w:proofErr w:type="spellStart"/>
+      <w:r>
+        <w:rPr>
+          <w:lang w:val="en-US"/>
+        </w:rPr>
+      </w:r>
+      <w:proofErr w:type="spellEnd"/>
+      <w:r>
+        <w:rPr>
+          <w:lang w:val="en-US"/>
+        </w:rPr>
+      </w:r>
+      <w:proofErr w:type="spellStart"/>
+      <w:r>
+        <w:rPr>
+          <w:lang w:val="en-US"/>
+        </w:rPr>
+      </w:r>
+      <w:proofErr w:type="spellEnd"/>
+      <w:r>
+        <w:rPr>
+          <w:lang w:val="en-US"/>
+        </w:rPr>
+      </w:r>
+      <w:proofErr w:type="spellStart"/>
+      <w:r>
+        <w:rPr>
+          <w:lang w:val="en-US"/>
+        </w:rPr>
+      </w:r>
+      <w:proofErr w:type="spellEnd"/>
+      <w:r>
+        <w:rPr>
+          <w:lang w:val="en-US"/>
+        </w:rPr>
       </w:r>
     </w:p>
     <w:p>

</xml_diff>